<commit_message>
modification in doc file
</commit_message>
<xml_diff>
--- a/Lecture.docx
+++ b/Lecture.docx
@@ -22,38 +22,147 @@
     </w:p>
     <w:p/>
     <w:p>
-      <w:r>
+      <w:pPr>
+        <w:rPr>
+          <w:b/>
+          <w:bCs/>
+        </w:rPr>
+      </w:pPr>
+      <w:r>
+        <w:rPr>
+          <w:b/>
+          <w:bCs/>
+        </w:rPr>
         <w:t xml:space="preserve">Lecture: Version control </w:t>
       </w:r>
     </w:p>
     <w:p>
       <w:r>
-        <w:t>git status</w:t>
+        <w:t xml:space="preserve">Let you have already project on </w:t>
+      </w:r>
+      <w:proofErr w:type="spellStart"/>
+      <w:r>
+        <w:t>github</w:t>
+      </w:r>
+      <w:proofErr w:type="spellEnd"/>
+      <w:r>
+        <w:t xml:space="preserve"> and you made some changes in that project now you want to push these changes in the so we can use these commands to do that </w:t>
       </w:r>
     </w:p>
     <w:p>
-      <w:r>
+      <w:pPr>
+        <w:rPr>
+          <w:b/>
+          <w:bCs/>
+        </w:rPr>
+      </w:pPr>
+      <w:r>
+        <w:rPr>
+          <w:b/>
+          <w:bCs/>
+        </w:rPr>
+        <w:t>git status</w:t>
+      </w:r>
+    </w:p>
+    <w:p>
+      <w:pPr>
+        <w:rPr>
+          <w:b/>
+          <w:bCs/>
+        </w:rPr>
+      </w:pPr>
+      <w:r>
+        <w:rPr>
+          <w:b/>
+          <w:bCs/>
+        </w:rPr>
         <w:t xml:space="preserve">git </w:t>
       </w:r>
       <w:proofErr w:type="gramStart"/>
       <w:r>
+        <w:rPr>
+          <w:b/>
+          <w:bCs/>
+        </w:rPr>
         <w:t>add .</w:t>
       </w:r>
       <w:proofErr w:type="gramEnd"/>
     </w:p>
     <w:p>
-      <w:r>
+      <w:pPr>
+        <w:rPr>
+          <w:b/>
+          <w:bCs/>
+        </w:rPr>
+      </w:pPr>
+      <w:r>
+        <w:rPr>
+          <w:b/>
+          <w:bCs/>
+        </w:rPr>
         <w:t>git commit -</w:t>
       </w:r>
       <w:r>
+        <w:rPr>
+          <w:b/>
+          <w:bCs/>
+        </w:rPr>
         <w:t>m “this is my final commit”</w:t>
       </w:r>
     </w:p>
     <w:p>
       <w:r>
+        <w:rPr>
+          <w:b/>
+          <w:bCs/>
+        </w:rPr>
         <w:t>git push origin main</w:t>
       </w:r>
+      <w:r>
+        <w:rPr>
+          <w:b/>
+          <w:bCs/>
+        </w:rPr>
+        <w:t xml:space="preserve"> </w:t>
+      </w:r>
+      <w:r>
+        <w:t xml:space="preserve">here instead of main you can have master or something else check it </w:t>
+      </w:r>
     </w:p>
+    <w:p>
+      <w:r>
+        <w:t xml:space="preserve">for creating a </w:t>
+      </w:r>
+      <w:proofErr w:type="gramStart"/>
+      <w:r>
+        <w:t>branch</w:t>
+      </w:r>
+      <w:proofErr w:type="gramEnd"/>
+      <w:r>
+        <w:t xml:space="preserve"> we can use </w:t>
+      </w:r>
+      <w:r>
+        <w:rPr>
+          <w:b/>
+          <w:bCs/>
+        </w:rPr>
+        <w:t xml:space="preserve">git branch swapn-test </w:t>
+      </w:r>
+      <w:r>
+        <w:t xml:space="preserve">so a branch would be generated with name swapn-test then run </w:t>
+      </w:r>
+      <w:r>
+        <w:rPr>
+          <w:b/>
+          <w:bCs/>
+        </w:rPr>
+        <w:t xml:space="preserve">git checkout swapn-test </w:t>
+      </w:r>
+      <w:r>
+        <w:t xml:space="preserve">this is for switching to new branch </w:t>
+      </w:r>
+    </w:p>
+    <w:p/>
     <w:p>
       <w:r>
         <w:t xml:space="preserve"> </w:t>

</xml_diff>

<commit_message>
doc update nothing serious
</commit_message>
<xml_diff>
--- a/Lecture.docx
+++ b/Lecture.docx
@@ -3,13 +3,8 @@
 <w:document xmlns:wpc="http://schemas.microsoft.com/office/word/2010/wordprocessingCanvas" xmlns:cx="http://schemas.microsoft.com/office/drawing/2014/chartex" xmlns:cx1="http://schemas.microsoft.com/office/drawing/2015/9/8/chartex" xmlns:cx2="http://schemas.microsoft.com/office/drawing/2015/10/21/chartex" xmlns:cx3="http://schemas.microsoft.com/office/drawing/2016/5/9/chartex" xmlns:cx4="http://schemas.microsoft.com/office/drawing/2016/5/10/chartex" xmlns:cx5="http://schemas.microsoft.com/office/drawing/2016/5/11/chartex" xmlns:cx6="http://schemas.microsoft.com/office/drawing/2016/5/12/chartex" xmlns:cx7="http://schemas.microsoft.com/office/drawing/2016/5/13/chartex" xmlns:cx8="http://schemas.microsoft.com/office/drawing/2016/5/14/chartex" xmlns:mc="http://schemas.openxmlformats.org/markup-compatibility/2006" xmlns:aink="http://schemas.microsoft.com/office/drawing/2016/ink" xmlns:am3d="http://schemas.microsoft.com/office/drawing/2017/model3d" xmlns:o="urn:schemas-microsoft-com:office:office" xmlns:oel="http://schemas.microsoft.com/office/2019/extlst" xmlns:r="http://schemas.openxmlformats.org/officeDocument/2006/relationships" xmlns:m="http://schemas.openxmlformats.org/officeDocument/2006/math" xmlns:v="urn:schemas-microsoft-com:vml" xmlns:wp14="http://schemas.microsoft.com/office/word/2010/wordprocessingDrawing" xmlns:wp="http://schemas.openxmlformats.org/drawingml/2006/wordprocessingDrawing" xmlns:w10="urn:schemas-microsoft-com:office:word" xmlns:w="http://schemas.openxmlformats.org/wordprocessingml/2006/main" xmlns:w14="http://schemas.microsoft.com/office/word/2010/wordml" xmlns:w15="http://schemas.microsoft.com/office/word/2012/wordml" xmlns:w16cex="http://schemas.microsoft.com/office/word/2018/wordml/cex" xmlns:w16cid="http://schemas.microsoft.com/office/word/2016/wordml/cid" xmlns:w16="http://schemas.microsoft.com/office/word/2018/wordml" xmlns:w16du="http://schemas.microsoft.com/office/word/2023/wordml/word16du" xmlns:w16sdtdh="http://schemas.microsoft.com/office/word/2020/wordml/sdtdatahash" xmlns:w16sdtfl="http://schemas.microsoft.com/office/word/2024/wordml/sdtformatlock" xmlns:w16se="http://schemas.microsoft.com/office/word/2015/wordml/symex" xmlns:wpg="http://schemas.microsoft.com/office/word/2010/wordprocessingGroup" xmlns:wpi="http://schemas.microsoft.com/office/word/2010/wordprocessingInk" xmlns:wne="http://schemas.microsoft.com/office/word/2006/wordml" xmlns:wps="http://schemas.microsoft.com/office/word/2010/wordprocessingShape" mc:Ignorable="w14 w15 w16se w16cid w16 w16cex w16sdtdh w16sdtfl w16du wp14">
   <w:body>
     <w:p>
-      <w:proofErr w:type="gramStart"/>
-      <w:r>
-        <w:t>Lecture :</w:t>
-      </w:r>
-      <w:proofErr w:type="gramEnd"/>
-      <w:r>
-        <w:t xml:space="preserve"> Introduction to </w:t>
+      <w:r>
+        <w:t xml:space="preserve">Lecture : Introduction to </w:t>
       </w:r>
       <w:proofErr w:type="spellStart"/>
       <w:r>
@@ -22,38 +17,154 @@
     </w:p>
     <w:p/>
     <w:p>
-      <w:r>
+      <w:pPr>
+        <w:rPr>
+          <w:b/>
+          <w:bCs/>
+        </w:rPr>
+      </w:pPr>
+      <w:r>
+        <w:rPr>
+          <w:b/>
+          <w:bCs/>
+        </w:rPr>
         <w:t xml:space="preserve">Lecture: Version control </w:t>
       </w:r>
     </w:p>
     <w:p>
       <w:r>
-        <w:t>git status</w:t>
+        <w:t xml:space="preserve">Let you have already project on </w:t>
+      </w:r>
+      <w:proofErr w:type="spellStart"/>
+      <w:r>
+        <w:t>github</w:t>
+      </w:r>
+      <w:proofErr w:type="spellEnd"/>
+      <w:r>
+        <w:t xml:space="preserve"> and you made some changes in that project now you want to push these changes in the so we can use these commands to do that </w:t>
       </w:r>
     </w:p>
     <w:p>
-      <w:r>
-        <w:t xml:space="preserve">git </w:t>
-      </w:r>
-      <w:proofErr w:type="gramStart"/>
-      <w:r>
-        <w:t>add .</w:t>
-      </w:r>
-      <w:proofErr w:type="gramEnd"/>
+      <w:pPr>
+        <w:rPr>
+          <w:b/>
+          <w:bCs/>
+        </w:rPr>
+      </w:pPr>
+      <w:r>
+        <w:rPr>
+          <w:b/>
+          <w:bCs/>
+        </w:rPr>
+        <w:t>git status</w:t>
+      </w:r>
     </w:p>
     <w:p>
-      <w:r>
-        <w:t>git commit -</w:t>
-      </w:r>
-      <w:r>
-        <w:t>m “this is my final commit”</w:t>
+      <w:pPr>
+        <w:rPr>
+          <w:b/>
+          <w:bCs/>
+        </w:rPr>
+      </w:pPr>
+      <w:r>
+        <w:rPr>
+          <w:b/>
+          <w:bCs/>
+        </w:rPr>
+        <w:t>git add .</w:t>
       </w:r>
     </w:p>
     <w:p>
-      <w:r>
+      <w:pPr>
+        <w:rPr>
+          <w:b/>
+          <w:bCs/>
+        </w:rPr>
+      </w:pPr>
+      <w:r>
+        <w:rPr>
+          <w:b/>
+          <w:bCs/>
+        </w:rPr>
+        <w:t>git commit -</w:t>
+      </w:r>
+      <w:r>
+        <w:rPr>
+          <w:b/>
+          <w:bCs/>
+        </w:rPr>
+        <w:t>m “this is my final commit”</w:t>
+      </w:r>
+    </w:p>
+    <w:p>
+      <w:r>
+        <w:rPr>
+          <w:b/>
+          <w:bCs/>
+        </w:rPr>
         <w:t>git push origin main</w:t>
       </w:r>
+      <w:r>
+        <w:rPr>
+          <w:b/>
+          <w:bCs/>
+        </w:rPr>
+        <w:t xml:space="preserve"> </w:t>
+      </w:r>
+      <w:r>
+        <w:t xml:space="preserve">here instead of main you can have master or something else check it </w:t>
+      </w:r>
     </w:p>
+    <w:p>
+      <w:r>
+        <w:t xml:space="preserve">for creating a branch we can use </w:t>
+      </w:r>
+      <w:r>
+        <w:rPr>
+          <w:b/>
+          <w:bCs/>
+        </w:rPr>
+        <w:t xml:space="preserve">git branch swapn-test </w:t>
+      </w:r>
+      <w:r>
+        <w:t xml:space="preserve">so a branch would be generated with name swapn-test then run </w:t>
+      </w:r>
+      <w:r>
+        <w:rPr>
+          <w:b/>
+          <w:bCs/>
+        </w:rPr>
+        <w:t xml:space="preserve">git checkout swapn-test </w:t>
+      </w:r>
+      <w:r>
+        <w:t xml:space="preserve">this is for switching to new branch </w:t>
+      </w:r>
+    </w:p>
+    <w:p>
+      <w:r>
+        <w:t xml:space="preserve">after this if you are making changes in the project and trying to push using above commands then it will eventually send a request that a new had request some changes </w:t>
+      </w:r>
+      <w:r>
+        <w:t xml:space="preserve">its </w:t>
+      </w:r>
+      <w:proofErr w:type="spellStart"/>
+      <w:r>
+        <w:t>upto</w:t>
+      </w:r>
+      <w:proofErr w:type="spellEnd"/>
+      <w:r>
+        <w:t xml:space="preserve"> you </w:t>
+      </w:r>
+      <w:proofErr w:type="spellStart"/>
+      <w:r>
+        <w:t>you</w:t>
+      </w:r>
+      <w:proofErr w:type="spellEnd"/>
+      <w:r>
+        <w:t xml:space="preserve"> will merge or decline but check all the things </w:t>
+      </w:r>
+    </w:p>
+    <w:p/>
     <w:p>
       <w:r>
         <w:t xml:space="preserve"> </w:t>

</xml_diff>